<commit_message>
Reframe Euclid DR1 hypervelocity project
</commit_message>
<xml_diff>
--- a/02_Euclid_DR1_Hypervelocity_Stars.docx
+++ b/02_Euclid_DR1_Hypervelocity_Stars.docx
@@ -13,7 +13,7 @@
         <w:rPr>
           <w:rFonts w:ascii="Arial" w:hAnsi="Arial" w:cs="Arial"/>
         </w:rPr>
-        <w:t>Project Title: Stars on the Run? Calibrating Euclid DR1 Slitless Spectroscopy for Hypervelocity-Star Searches</w:t>
+        <w:t>Project Title: Stars on the Run: Discovering Hypervelocity and Runaway Stars with Euclid DR1</w:t>
       </w:r>
     </w:p>
     <w:p>
@@ -99,25 +99,25 @@
           <w:sz w:val="22"/>
           <w:szCs w:val="22"/>
         </w:rPr>
-        <w:t>The term hypervelocity star is often used loosely for any apparently unbound star. In this project it will mean a classical Galactic-centre ejectee produced when the massive black hole disrupts a stellar binary. S5-HVS1, discovered by Koposov et al. (2020), remains the only securely established example. It is unbound, its accurately measured trajectory points back to the Galactic Centre, and its inferred ejection speed of about 1800 kilometres per second strongly favours ejection by Sgr A*. Other extreme-speed stars will be described as high-velocity or runaway candidates until their birthplace is established.</w:t>
-      </w:r>
-    </w:p>
-    <w:p>
-      <w:pPr>
-        <w:spacing w:before="40" w:after="0" w:line="360" w:lineRule="auto"/>
-        <w:rPr>
-          <w:rFonts w:ascii="Arial" w:hAnsi="Arial" w:cs="Arial"/>
-          <w:sz w:val="22"/>
-          <w:szCs w:val="22"/>
-        </w:rPr>
-      </w:pPr>
-      <w:r>
-        <w:rPr>
-          <w:rFonts w:ascii="Arial" w:hAnsi="Arial" w:cs="Arial"/>
-          <w:sz w:val="22"/>
-          <w:szCs w:val="22"/>
-        </w:rPr>
-        <w:t>Euclid's NISP instrument supplies low-resolution near-infrared slitless spectra for many stars too faint for Gaia radial velocities. This project will test whether those spectra can identify stars moving at extreme speeds. The student will calibrate the public Euclid velocity estimates against Gaia and ground-based spectroscopy, develop a template-fitting and quality-control procedure, and measure completeness and the catastrophic-failure rate with injection–recovery tests. The calibrated method will then be applied to astrometrically and spectroscopically selected candidates. The primary goal is a credible new extreme-velocity candidate; even a null result will yield a validated stellar-velocity selection function and a DR1-ready candidate pipeline.</w:t>
+        <w:t>The fastest stars in the Milky Way record violent ejections from the Galactic Centre, stellar binaries, and dense clusters. A classical hypervelocity star is expelled from the Galactic Centre after the massive black hole disrupts a stellar binary. S5-HVS1, discovered by Koposov et al. (2020), remains the only securely established example: it is unbound and its trajectory points back to the Galactic Centre. Other extreme-velocity stars can be launched by supernovae in binaries or by dynamical encounters in the disc, star clusters, or the Magellanic Clouds. These runaways are discoveries in their own right because their motions identify otherwise hidden episodes of stellar interaction and ejection.</w:t>
+      </w:r>
+    </w:p>
+    <w:p>
+      <w:pPr>
+        <w:spacing w:before="40" w:after="0" w:line="360" w:lineRule="auto"/>
+        <w:rPr>
+          <w:rFonts w:ascii="Arial" w:hAnsi="Arial" w:cs="Arial"/>
+          <w:sz w:val="22"/>
+          <w:szCs w:val="22"/>
+        </w:rPr>
+      </w:pPr>
+      <w:r>
+        <w:rPr>
+          <w:rFonts w:ascii="Arial" w:hAnsi="Arial" w:cs="Arial"/>
+          <w:sz w:val="22"/>
+          <w:szCs w:val="22"/>
+        </w:rPr>
+        <w:t>Euclid DR1 will supply low-resolution near-infrared slitless spectra for many stars without Gaia radial velocities. The main aim is to discover and characterise new hypervelocity and runaway-star candidates. The student will first establish how accurately Euclid measures stellar velocities, using stars with reliable external spectroscopy and testing the result across magnitude, signal-to-noise, and spectral type. The calibrated sample will then support two searches: a blind hunt for extreme radial-velocity outliers and a Gaia-guided search for stars with unusually large tangential speeds. No stellar type will be excluded in advance. The strongest candidates will be checked in the Euclid spectra, combined with Gaia astrometry, and traced through the Galaxy to constrain their origins.</w:t>
       </w:r>
     </w:p>
     <w:p>
@@ -149,43 +149,43 @@
           <w:sz w:val="22"/>
           <w:szCs w:val="22"/>
         </w:rPr>
-        <w:t>S5-HVS1 sets the evidential standard for this project: an extreme line-of-sight velocity alone is not enough. A secure hypervelocity interpretation requires reliable six-dimensional phase space, a stellar lifetime consistent with the flight time, and a backward trajectory that distinguishes the Galactic Centre from a disc crossing or the LMC. Supernovae and dynamical interactions in the disc, clusters or Magellanic Clouds can produce fast runaways, including unbound stars, without making them classical Hills ejecta. The orbit and birthplace—not merely a velocity threshold—therefore define the object of the search.</w:t>
-      </w:r>
-    </w:p>
-    <w:p>
-      <w:pPr>
-        <w:spacing w:before="40" w:after="0" w:line="360" w:lineRule="auto"/>
-        <w:rPr>
-          <w:rFonts w:ascii="Arial" w:hAnsi="Arial" w:cs="Arial"/>
-          <w:sz w:val="22"/>
-          <w:szCs w:val="22"/>
-        </w:rPr>
-      </w:pPr>
-      <w:r>
-        <w:rPr>
-          <w:rFonts w:ascii="Arial" w:hAnsi="Arial" w:cs="Arial"/>
-          <w:sz w:val="22"/>
-          <w:szCs w:val="22"/>
-        </w:rPr>
-        <w:t>Euclid NISP wide-survey spectra cover approximately 1.21–1.89 microns at resolving power near 500. Cool-star spectra contain metal and molecular features; hotter stars show hydrogen lines. The nominal resolution corresponds to several hundred kilometres per second, so an extreme Doppler shift moves a feature by only about one or two detector pixels. The project will establish empirically whether sub-resolution centroiding is reliable for each spectral type and signal-to-noise range.</w:t>
-      </w:r>
-    </w:p>
-    <w:p>
-      <w:pPr>
-        <w:spacing w:before="40" w:after="0" w:line="360" w:lineRule="auto"/>
-        <w:rPr>
-          <w:rFonts w:ascii="Arial" w:hAnsi="Arial" w:cs="Arial"/>
-          <w:sz w:val="22"/>
-          <w:szCs w:val="22"/>
-        </w:rPr>
-      </w:pPr>
-      <w:r>
-        <w:rPr>
-          <w:rFonts w:ascii="Arial" w:hAnsi="Arial" w:cs="Arial"/>
-          <w:sz w:val="22"/>
-          <w:szCs w:val="22"/>
-        </w:rPr>
-        <w:t>Slitless spectroscopy adds distinctive failure modes. Spectra can overlap; zero orders, detector gaps, and persistence can be mistaken for features; source-position errors become wavelength zero-point errors; and an imperfect template may drive a fit to an extreme velocity boundary. The public Q1 spectra provide a controlled testbed for diagnosing these effects through individual dithers, masks, and contaminating-source metadata. Q1 is therefore the core dataset. The much larger DR1 footprint is a scale-up if the required spectroscopy products are released during the project, not a dependency for a successful dissertation.</w:t>
+        <w:t>When a close binary passes near Sgr A*, tidal forces can capture one star and eject the other at more than the Galactic escape speed (Hills 1988). A large measured velocity is not enough to prove this origin. The distance, proper motion, and radial velocity must yield an unbound orbit whose past trajectory intersects the Galactic Centre within the star's lifetime. S5-HVS1 meets this standard. Until comparable evidence exists, this project will use 'hypervelocity candidate' rather than turn every fast star into a Galactic-centre ejectee.</w:t>
+      </w:r>
+    </w:p>
+    <w:p>
+      <w:pPr>
+        <w:spacing w:before="40" w:after="0" w:line="360" w:lineRule="auto"/>
+        <w:rPr>
+          <w:rFonts w:ascii="Arial" w:hAnsi="Arial" w:cs="Arial"/>
+          <w:sz w:val="22"/>
+          <w:szCs w:val="22"/>
+        </w:rPr>
+      </w:pPr>
+      <w:r>
+        <w:rPr>
+          <w:rFonts w:ascii="Arial" w:hAnsi="Arial" w:cs="Arial"/>
+          <w:sz w:val="22"/>
+          <w:szCs w:val="22"/>
+        </w:rPr>
+        <w:t>Fast stars with other birthplaces probe different physics. A supernova can release the companion in a binary, and close encounters in young clusters can eject single stars or binaries. The disc, massive clusters, and the Magellanic Clouds can therefore produce bound or unbound runaways. Their speeds, ages, chemistry, and reconstructed launch sites test binary evolution, supernova kicks, and stellar dynamics. The search will retain these objects and separate origin classes only after the kinematic evidence has been examined.</w:t>
+      </w:r>
+    </w:p>
+    <w:p>
+      <w:pPr>
+        <w:spacing w:before="40" w:after="0" w:line="360" w:lineRule="auto"/>
+        <w:rPr>
+          <w:rFonts w:ascii="Arial" w:hAnsi="Arial" w:cs="Arial"/>
+          <w:sz w:val="22"/>
+          <w:szCs w:val="22"/>
+        </w:rPr>
+      </w:pPr>
+      <w:r>
+        <w:rPr>
+          <w:rFonts w:ascii="Arial" w:hAnsi="Arial" w:cs="Arial"/>
+          <w:sz w:val="22"/>
+          <w:szCs w:val="22"/>
+        </w:rPr>
+        <w:t>Euclid opens a new discovery space because NISP obtains slitless spectra over a wide area and reaches stars fainter than Gaia's radial-velocity sample. Its resolving power is modest, and different stellar types carry different near-infrared velocity information: hot stars are dominated by hydrogen lines, whereas cooler stars offer metal and molecular features. Slitless spectra can also overlap or acquire wavelength errors from source positions, detector edges, and imperfect contamination models. The project will therefore measure the velocity performance empirically rather than impose a favoured stellar type. Public Q1 spectra provide material for building and testing the code at the start of the academic year; DR1 provides the discovery sample.</w:t>
       </w:r>
     </w:p>
     <w:p>
@@ -217,7 +217,7 @@
           <w:sz w:val="22"/>
           <w:szCs w:val="22"/>
         </w:rPr>
-        <w:t>A simple cut on the published Euclid velocity column would return many catastrophic outliers, not a credible hypervelocity sample. The project will instead treat velocity measurement and uncertainty calibration as the central experiment. Only after blind recovery tests have defined a reliable domain in magnitude, spectral type and contamination will the candidate search begin.</w:t>
+        <w:t>During the first part of the academic year, the student will turn the released Q1 products into a simple, tested pipeline and prepare both search routes before applying them to Euclid DR1:</w:t>
       </w:r>
     </w:p>
     <w:p>
@@ -243,15 +243,15 @@
           <w:b/>
           <w:bCs/>
         </w:rPr>
-        <w:t xml:space="preserve">Assemble an empirical truth set. </w:t>
-      </w:r>
-      <w:r>
-        <w:rPr>
-          <w:rFonts w:ascii="Arial" w:hAnsi="Arial" w:cs="Arial"/>
-          <w:sz w:val="22"/>
-          <w:szCs w:val="22"/>
-        </w:rPr>
-        <w:t>Query the Q1 source, spectroscopy, and combined-spectra products, and cross-match point-like sources to Gaia and external radial-velocity surveys such as DESI, APOGEE, SDSS, LAMOST, or GALAH where coverage permits. Retain individual dither spectra, variance arrays, masks, line-spread information, and contaminating-object identifiers. The truth set will span colour, magnitude, continuum signal-to-noise, and spectral type.</w:t>
+        <w:t xml:space="preserve">Prepare the calibration sample. </w:t>
+      </w:r>
+      <w:r>
+        <w:rPr>
+          <w:rFonts w:ascii="Arial" w:hAnsi="Arial" w:cs="Arial"/>
+          <w:sz w:val="22"/>
+          <w:szCs w:val="22"/>
+        </w:rPr>
+        <w:t>Cross-match Q1 stars with reliable velocities from Gaia and ground-based surveys, and assemble test cases spanning magnitude, colour, signal-to-noise, and spectral morphology. Known fast stars and injected Doppler shifts will test the code before DR1 arrives.</w:t>
       </w:r>
     </w:p>
     <w:p>
@@ -277,15 +277,15 @@
           <w:b/>
           <w:bCs/>
         </w:rPr>
-        <w:t xml:space="preserve">Diagnose the catalogue velocities. </w:t>
-      </w:r>
-      <w:r>
-        <w:rPr>
-          <w:rFonts w:ascii="Arial" w:hAnsi="Arial" w:cs="Arial"/>
-          <w:sz w:val="22"/>
-          <w:szCs w:val="22"/>
-        </w:rPr>
-        <w:t>Measure residuals between Euclid and reference velocities as functions of source properties, detector position, number of usable dithers, model probability, morphology, and overlap flags. Identify grid-edge pile-ups, velocity quantisation, underestimated errors, and wavelength-frame or zero-point offsets. This stage will define a conservative baseline selection and document when the public SPE_RVEL estimate can and cannot be trusted.</w:t>
+        <w:t xml:space="preserve">Establish the DR1 velocity calibration. </w:t>
+      </w:r>
+      <w:r>
+        <w:rPr>
+          <w:rFonts w:ascii="Arial" w:hAnsi="Arial" w:cs="Arial"/>
+          <w:sz w:val="22"/>
+          <w:szCs w:val="22"/>
+        </w:rPr>
+        <w:t>Compare Euclid and reference velocities to measure offsets, scatter, and catastrophic failures. Repeat the comparison across spectral type and basic quality indicators. The result will define where the catalogue velocities are trustworthy; direct spectral refitting will be reserved for promising candidates whose catalogue measurements remain uncertain.</w:t>
       </w:r>
     </w:p>
     <w:p>
@@ -311,15 +311,15 @@
           <w:b/>
           <w:bCs/>
         </w:rPr>
-        <w:t xml:space="preserve">Refit the stellar spectra. </w:t>
-      </w:r>
-      <w:r>
-        <w:rPr>
-          <w:rFonts w:ascii="Arial" w:hAnsi="Arial" w:cs="Arial"/>
-          <w:sz w:val="22"/>
-          <w:szCs w:val="22"/>
-        </w:rPr>
-        <w:t>Fit Doppler-shifted empirical or synthetic stellar templates convolved with the NISP line-spread function, marginalising over the continuum, stellar subtype, and wavelength zero point. Use a joint likelihood for the separate orientations and dithers, and require mutually consistent velocities from independent spectra. Compare the new likelihoods with the catalogue estimates on a held-out validation set.</w:t>
+        <w:t xml:space="preserve">Search the Euclid spectra blindly. </w:t>
+      </w:r>
+      <w:r>
+        <w:rPr>
+          <w:rFonts w:ascii="Arial" w:hAnsi="Arial" w:cs="Arial"/>
+          <w:sz w:val="22"/>
+          <w:szCs w:val="22"/>
+        </w:rPr>
+        <w:t>Within each validated regime, identify stars whose radial velocities lie far beyond the ordinary Galactic distribution. Rank the outliers using the calibrated uncertainty and the quality of the underlying spectra, not the catalogue value alone.</w:t>
       </w:r>
     </w:p>
     <w:p>
@@ -345,15 +345,15 @@
           <w:b/>
           <w:bCs/>
         </w:rPr>
-        <w:t xml:space="preserve">Measure the selection function. </w:t>
-      </w:r>
-      <w:r>
-        <w:rPr>
-          <w:rFonts w:ascii="Arial" w:hAnsi="Arial" w:cs="Arial"/>
-          <w:sz w:val="22"/>
-          <w:szCs w:val="22"/>
-        </w:rPr>
-        <w:t>Inject velocities over a pre-declared range that spans the candidate threshold and extends to the velocity-grid boundaries, treating B/A and FGKM stars separately. Recover them with the same code and quantify bias, calibrated uncertainty, completeness, and catastrophic-outlier rate as functions of magnitude, type, and contamination. This experiment will determine the useful part of parameter space.</w:t>
+        <w:t xml:space="preserve">Search the Gaia-selected sample. </w:t>
+      </w:r>
+      <w:r>
+        <w:rPr>
+          <w:rFonts w:ascii="Arial" w:hAnsi="Arial" w:cs="Arial"/>
+          <w:sz w:val="22"/>
+          <w:szCs w:val="22"/>
+        </w:rPr>
+        <w:t>Use Gaia astrometry to find stars with unusually large tangential speeds or motions suggestive of ejection. Euclid will supply radial-velocity information for objects beyond Gaia's spectroscopic limit, completing their three-dimensional motion.</w:t>
       </w:r>
     </w:p>
     <w:p>
@@ -379,15 +379,15 @@
           <w:b/>
           <w:bCs/>
         </w:rPr>
-        <w:t xml:space="preserve">Search for high-velocity candidates. </w:t>
-      </w:r>
-      <w:r>
-        <w:rPr>
-          <w:rFonts w:ascii="Arial" w:hAnsi="Arial" w:cs="Arial"/>
-          <w:sz w:val="22"/>
-          <w:szCs w:val="22"/>
-        </w:rPr>
-        <w:t>Follow two complementary routes. First, preselect stars with high tangential speeds or hypervelocity-like colours and no reliable Gaia radial velocity, then use Euclid to complete their three-dimensional velocity. Second, search for spectroscopic outliers only within the validated Euclid domain. Candidate ranking will use a posterior probability that includes the calibrated non-Gaussian outlier model rather than raw SPE_RVEL.</w:t>
+        <w:t xml:space="preserve">Vet every credible candidate. </w:t>
+      </w:r>
+      <w:r>
+        <w:rPr>
+          <w:rFonts w:ascii="Arial" w:hAnsi="Arial" w:cs="Arial"/>
+          <w:sz w:val="22"/>
+          <w:szCs w:val="22"/>
+        </w:rPr>
+        <w:t>Inspect the one- and two-dimensional Euclid spectra and the separate exposures, reject overlaps and reduction artefacts, and check Gaia astrometric quality and possible binary explanations. External spectroscopy will be used when available, especially for the strongest candidates.</w:t>
       </w:r>
     </w:p>
     <w:p>
@@ -413,33 +413,33 @@
           <w:b/>
           <w:bCs/>
         </w:rPr>
-        <w:t xml:space="preserve">Vet the spectra and reconstruct the orbit. </w:t>
-      </w:r>
-      <w:r>
-        <w:rPr>
-          <w:rFonts w:ascii="Arial" w:hAnsi="Arial" w:cs="Arial"/>
-          <w:sz w:val="22"/>
-          <w:szCs w:val="22"/>
-        </w:rPr>
-        <w:t>Inspect the one- and two-dimensional spectra, require agreement across dithers or orientations, and reject overlaps, zero orders, persistence, detector edges and weak single-feature fits. Test Gaia astrometric fidelity, distances, source morphology and binary explanations, and seek external radial velocities where possible. For credible objects, propagate the full astrometric covariance and Euclid velocity likelihood into Galactocentric velocities, unbound probabilities in several Milky Way potentials, and possible Galactic-centre, disc or Magellanic origins.</w:t>
-      </w:r>
-    </w:p>
-    <w:p>
-      <w:pPr>
-        <w:spacing w:before="40" w:after="0" w:line="360" w:lineRule="auto"/>
-        <w:rPr>
-          <w:rFonts w:ascii="Arial" w:hAnsi="Arial" w:cs="Arial"/>
-          <w:sz w:val="22"/>
-          <w:szCs w:val="22"/>
-        </w:rPr>
-      </w:pPr>
-      <w:r>
-        <w:rPr>
-          <w:rFonts w:ascii="Arial" w:hAnsi="Arial" w:cs="Arial"/>
-          <w:sz w:val="22"/>
-          <w:szCs w:val="22"/>
-        </w:rPr>
-        <w:t>The core deliverables are a calibrated stellar radial-velocity method for Q1, a map of its failure modes, an injection–recovery selection function and a vetted candidate catalogue or upper limit. Objects will be called high-velocity candidates until their three-dimensional motion, preferably confirmed by follow-up spectroscopy, supports an unbound orbit whose backward trajectory is consistent with the Galactic Centre. Only then will the project use the strict hypervelocity-star label. If the appropriate DR1 spectra arrive in time, the pipeline can be scaled to the wider footprint; otherwise it will be delivered ready for that release.</w:t>
+        <w:t xml:space="preserve">Reconstruct trajectories and origins. </w:t>
+      </w:r>
+      <w:r>
+        <w:rPr>
+          <w:rFonts w:ascii="Arial" w:hAnsi="Arial" w:cs="Arial"/>
+          <w:sz w:val="22"/>
+          <w:szCs w:val="22"/>
+        </w:rPr>
+        <w:t>Combine the calibrated Euclid velocity with Gaia astrometry, propagate the measurement uncertainties, and trace each candidate through plausible Milky Way potentials. Classify the evidence for a Galactic-centre, disc, cluster, or Magellanic origin, while retaining an uncertain category when the data do not decide.</w:t>
+      </w:r>
+    </w:p>
+    <w:p>
+      <w:pPr>
+        <w:spacing w:before="40" w:after="0" w:line="360" w:lineRule="auto"/>
+        <w:rPr>
+          <w:rFonts w:ascii="Arial" w:hAnsi="Arial" w:cs="Arial"/>
+          <w:sz w:val="22"/>
+          <w:szCs w:val="22"/>
+        </w:rPr>
+      </w:pPr>
+      <w:r>
+        <w:rPr>
+          <w:rFonts w:ascii="Arial" w:hAnsi="Arial" w:cs="Arial"/>
+          <w:sz w:val="22"/>
+          <w:szCs w:val="22"/>
+        </w:rPr>
+        <w:t>The main deliverable will be a ranked catalogue of new hypervelocity and runaway-star candidates from Euclid DR1, with calibrated velocities and initial origin assessments for the strongest objects. A Galactic-centre trajectory would make a candidate for the next classical hypervelocity star; a convincing disc, cluster, or Magellanic runaway would be an important discovery in its own right.</w:t>
       </w:r>
     </w:p>
     <w:p>
@@ -471,7 +471,7 @@
           <w:sz w:val="22"/>
           <w:szCs w:val="22"/>
         </w:rPr>
-        <w:t>The student should be comfortable with scientific Python, basic probability and statistics, and introductory stellar astronomy. Experience with FITS spectra, Astropy or catalogue queries would be useful but is not essential. Spectroscopic template fitting, uncertainty calibration and Galactic orbit modelling can be learned during the project; no previous Euclid experience is required.</w:t>
+        <w:t>The student should be comfortable with scientific Python, basic probability and statistics, and introductory stellar astronomy. Experience with spectra, Astropy, or catalogue queries would help but is not required. Empirical calibration and Galactic orbit modelling can be learned during the project; no previous Euclid experience is expected.</w:t>
       </w:r>
     </w:p>
     <w:p>
@@ -509,7 +509,7 @@
           <w:sz w:val="22"/>
           <w:szCs w:val="22"/>
         </w:rPr>
-        <w:t>Querying and cross-matching Euclid, Gaia and ground-based spectroscopic catalogues.</w:t>
+        <w:t>Querying and cross-matching Euclid, Gaia, and ground-based spectroscopic catalogues.</w:t>
       </w:r>
     </w:p>
     <w:p>
@@ -533,7 +533,7 @@
           <w:sz w:val="22"/>
           <w:szCs w:val="22"/>
         </w:rPr>
-        <w:t>One-dimensional spectral modelling, Doppler shifts and line-spread-function convolution.</w:t>
+        <w:t>Empirical radial-velocity calibration and interpretation of slitless spectra.</w:t>
       </w:r>
     </w:p>
     <w:p>
@@ -557,7 +557,7 @@
           <w:sz w:val="22"/>
           <w:szCs w:val="22"/>
         </w:rPr>
-        <w:t>Robust likelihoods, non-Gaussian outlier models and empirical uncertainty calibration.</w:t>
+        <w:t>Searches for rare outliers with realistic measurement errors.</w:t>
       </w:r>
     </w:p>
     <w:p>
@@ -581,7 +581,7 @@
           <w:sz w:val="22"/>
           <w:szCs w:val="22"/>
         </w:rPr>
-        <w:t>Injection–recovery tests and quantitative survey selection functions.</w:t>
+        <w:t>Transformation to Galactocentric phase space and orbit integration.</w:t>
       </w:r>
     </w:p>
     <w:p>
@@ -605,7 +605,7 @@
           <w:sz w:val="22"/>
           <w:szCs w:val="22"/>
         </w:rPr>
-        <w:t>Transformation to Galactocentric phase space, orbit integration and reproducible candidate vetting.</w:t>
+        <w:t>Reproducible candidate vetting and scientific visualisation.</w:t>
       </w:r>
     </w:p>
     <w:p>
@@ -723,7 +723,7 @@
           <w:sz w:val="22"/>
           <w:szCs w:val="22"/>
         </w:rPr>
-        <w:t>Brown, W. R. (2015), ‘Hypervelocity Stars’, Annual Review of Astronomy and Astrophysics, 53, 15. https://doi.org/10.1146/annurev-astro-082214-122230</w:t>
+        <w:t>Renzo, M. et al. (2019), 'Massive runaway and walkaway stars', A&amp;A, 624, A66. https://doi.org/10.1051/0004-6361/201833297</w:t>
       </w:r>
     </w:p>
     <w:p>
@@ -833,7 +833,7 @@
           <w:sz w:val="22"/>
           <w:szCs w:val="22"/>
         </w:rPr>
-        <w:t>Rybizki, J. et al. (2022), ‘Cleaning and characterizing the Gaia EDR3 catalogue’, MNRAS, 510, 2597. https://doi.org/10.1093/mnras/stab3588</w:t>
+        <w:t>ESA and Euclid, 'Euclid DR1 release dates, footprint, and data content'. https://euclid.caltech.edu/page/euclid-dr1</w:t>
       </w:r>
     </w:p>
     <w:p>
@@ -857,7 +857,7 @@
           <w:sz w:val="22"/>
           <w:szCs w:val="22"/>
         </w:rPr>
-        <w:t>Euclid Q1 Data Product Definition Document, SIR combined-spectra product card; Q1 data release. https://doi.org/10.57780/esa-2853f3b</w:t>
+        <w:t>ESA, 'Euclid Q1 contents and spectroscopic products'. https://www.cosmos.esa.int/web/euclid/q1-contents</w:t>
       </w:r>
     </w:p>
     <w:sectPr>

</xml_diff>